<commit_message>
feat: improve upload UI, env cleanup, DOCX template generation, UX polish
- Upload form: drag-and-drop zone, file preview, collapsible optional fields,
  pipeline progress indicator, rich result card with per-step status
- Env files: remove unused vars (TWILIO_FROM_NUMBER, RECORDING_STORAGE_DIR),
  add missing vars (VOICE_APP_DATABASE_URL, Twilio creds, Google OAuth),
  reorganize with section headers matching actual code usage
- DOCX export: switch from programmatic docx to template-based generation
  using docxtemplater/pizzip, clean up template token layout
- Incidents table: clickable rows navigate to detail page
- Recording webhook: fix Buffer/BlobPart type error with Uint8Array
</commit_message>
<xml_diff>
--- a/templates/incident_form_template_with_tokens.docx
+++ b/templates/incident_form_template_with_tokens.docx
@@ -4954,1028 +4954,739 @@
     <w:p/>
     <w:p/>
     <w:p/>
+    <w:p/>
     <w:p>
       <w:pPr>
         <w:pStyle w:val="Heading1"/>
-        <w:rPr>
-          <w:lang w:val="en-US"/>
-        </w:rPr>
-      </w:pPr>
-      <w:r>
-        <w:rPr>
-          <w:lang w:val="en-US"/>
-        </w:rPr>
-        <w:lastRenderedPageBreak/>
-        <w:t>Support Call Incident Form — Token Template</w:t>
+      </w:pPr>
+      <w:r>
+        <w:t>Support Call Incident Form</w:t>
       </w:r>
     </w:p>
     <w:p>
       <w:pPr>
         <w:pStyle w:val="Heading2"/>
-        <w:rPr>
-          <w:lang w:val="en-US"/>
-        </w:rPr>
-      </w:pPr>
-      <w:proofErr w:type="spellStart"/>
-      <w:r>
-        <w:rPr>
-          <w:lang w:val="en-US"/>
-        </w:rPr>
-        <w:t>form_id</w:t>
-      </w:r>
-      <w:proofErr w:type="spellEnd"/>
-      <w:r>
-        <w:rPr>
-          <w:lang w:val="en-US"/>
-        </w:rPr>
-        <w:t xml:space="preserve"> — Unique identifier for this completed form.</w:t>
-      </w:r>
-    </w:p>
-    <w:p>
-      <w:pPr>
-        <w:ind w:left="567"/>
-        <w:rPr>
-          <w:lang w:val="en-US"/>
-        </w:rPr>
-      </w:pPr>
-      <w:r>
-        <w:rPr>
-          <w:b/>
-          <w:color w:val="00008B"/>
-          <w:lang w:val="en-US"/>
-        </w:rPr>
-        <w:t>{</w:t>
-      </w:r>
-      <w:proofErr w:type="spellStart"/>
-      <w:r>
-        <w:rPr>
-          <w:b/>
-          <w:color w:val="00008B"/>
-          <w:lang w:val="en-US"/>
-        </w:rPr>
-        <w:t>form_id</w:t>
-      </w:r>
-      <w:proofErr w:type="spellEnd"/>
-      <w:r>
-        <w:rPr>
-          <w:b/>
-          <w:color w:val="00008B"/>
-          <w:lang w:val="en-US"/>
-        </w:rPr>
-        <w:t>}</w:t>
-      </w:r>
-      <w:r>
-        <w:rPr>
-          <w:lang w:val="en-US"/>
-        </w:rPr>
-        <w:t xml:space="preserve"> — Unique identifier for this completed form.</w:t>
-      </w:r>
-    </w:p>
-    <w:p>
-      <w:pPr>
-        <w:rPr>
-          <w:lang w:val="en-US"/>
-        </w:rPr>
-      </w:pPr>
-    </w:p>
+      </w:pPr>
+      <w:r>
+        <w:t>Caller Information</w:t>
+      </w:r>
+    </w:p>
+    <w:tbl>
+      <w:tblPr>
+        <w:tblW w:type="auto" w:w="0"/>
+        <w:tblLook w:firstColumn="1" w:firstRow="1" w:lastColumn="0" w:lastRow="0" w:noHBand="0" w:noVBand="1" w:val="04A0"/>
+        <w:tblBorders>
+          <w:top w:val="single" w:sz="4" w:space="0" w:color="000000"/>
+          <w:left w:val="single" w:sz="4" w:space="0" w:color="000000"/>
+          <w:bottom w:val="single" w:sz="4" w:space="0" w:color="000000"/>
+          <w:right w:val="single" w:sz="4" w:space="0" w:color="000000"/>
+          <w:insideH w:val="single" w:sz="4" w:space="0" w:color="000000"/>
+          <w:insideV w:val="single" w:sz="4" w:space="0" w:color="000000"/>
+        </w:tblBorders>
+      </w:tblPr>
+      <w:tblGrid>
+        <w:gridCol w:w="4819"/>
+        <w:gridCol w:w="4819"/>
+      </w:tblGrid>
+      <w:tr>
+        <w:tc>
+          <w:tcPr>
+            <w:tcW w:type="dxa" w:w="4819"/>
+            <w:shd w:fill="D9E2F3" w:val="clear"/>
+          </w:tcPr>
+          <w:p>
+            <w:r>
+              <w:rPr>
+                <w:b/>
+              </w:rPr>
+              <w:t>Field</w:t>
+            </w:r>
+          </w:p>
+        </w:tc>
+        <w:tc>
+          <w:tcPr>
+            <w:tcW w:type="dxa" w:w="4819"/>
+            <w:shd w:fill="D9E2F3" w:val="clear"/>
+          </w:tcPr>
+          <w:p>
+            <w:r>
+              <w:rPr>
+                <w:b/>
+              </w:rPr>
+              <w:t>Value</w:t>
+            </w:r>
+          </w:p>
+        </w:tc>
+      </w:tr>
+      <w:tr>
+        <w:tc>
+          <w:tcPr>
+            <w:tcW w:type="dxa" w:w="4819"/>
+          </w:tcPr>
+          <w:p>
+            <w:r>
+              <w:rPr>
+                <w:b/>
+              </w:rPr>
+              <w:t>Name</w:t>
+            </w:r>
+          </w:p>
+        </w:tc>
+        <w:tc>
+          <w:tcPr>
+            <w:tcW w:type="dxa" w:w="4819"/>
+          </w:tcPr>
+          <w:p>
+            <w:r>
+              <w:t>{caller_information.name}</w:t>
+            </w:r>
+          </w:p>
+        </w:tc>
+      </w:tr>
+      <w:tr>
+        <w:tc>
+          <w:tcPr>
+            <w:tcW w:type="dxa" w:w="4819"/>
+          </w:tcPr>
+          <w:p>
+            <w:r>
+              <w:rPr>
+                <w:b/>
+              </w:rPr>
+              <w:t>Account / Reference</w:t>
+            </w:r>
+          </w:p>
+        </w:tc>
+        <w:tc>
+          <w:tcPr>
+            <w:tcW w:type="dxa" w:w="4819"/>
+          </w:tcPr>
+          <w:p>
+            <w:r>
+              <w:t>{caller_information.account_or_reference}</w:t>
+            </w:r>
+          </w:p>
+        </w:tc>
+      </w:tr>
+      <w:tr>
+        <w:tc>
+          <w:tcPr>
+            <w:tcW w:type="dxa" w:w="4819"/>
+          </w:tcPr>
+          <w:p>
+            <w:r>
+              <w:rPr>
+                <w:b/>
+              </w:rPr>
+              <w:t>Contact Info</w:t>
+            </w:r>
+          </w:p>
+        </w:tc>
+        <w:tc>
+          <w:tcPr>
+            <w:tcW w:type="dxa" w:w="4819"/>
+          </w:tcPr>
+          <w:p>
+            <w:r>
+              <w:t>{caller_information.contact_info}</w:t>
+            </w:r>
+          </w:p>
+        </w:tc>
+      </w:tr>
+    </w:tbl>
     <w:p>
       <w:pPr>
         <w:pStyle w:val="Heading2"/>
-        <w:rPr>
-          <w:lang w:val="en-US"/>
-        </w:rPr>
-      </w:pPr>
-      <w:proofErr w:type="spellStart"/>
-      <w:r>
-        <w:rPr>
-          <w:lang w:val="en-US"/>
-        </w:rPr>
-        <w:t>completed_at</w:t>
-      </w:r>
-      <w:proofErr w:type="spellEnd"/>
-      <w:r>
-        <w:rPr>
-          <w:lang w:val="en-US"/>
-        </w:rPr>
-        <w:t xml:space="preserve"> — When the AI completed filling out this form.</w:t>
-      </w:r>
-    </w:p>
-    <w:p>
-      <w:pPr>
-        <w:ind w:left="567"/>
-        <w:rPr>
-          <w:lang w:val="en-US"/>
-        </w:rPr>
-      </w:pPr>
-      <w:r>
-        <w:rPr>
-          <w:b/>
-          <w:color w:val="00008B"/>
-          <w:lang w:val="en-US"/>
-        </w:rPr>
-        <w:t>{</w:t>
-      </w:r>
-      <w:proofErr w:type="spellStart"/>
-      <w:r>
-        <w:rPr>
-          <w:b/>
-          <w:color w:val="00008B"/>
-          <w:lang w:val="en-US"/>
-        </w:rPr>
-        <w:t>completed_at</w:t>
-      </w:r>
-      <w:proofErr w:type="spellEnd"/>
-      <w:r>
-        <w:rPr>
-          <w:b/>
-          <w:color w:val="00008B"/>
-          <w:lang w:val="en-US"/>
-        </w:rPr>
-        <w:t>}</w:t>
-      </w:r>
-      <w:r>
-        <w:rPr>
-          <w:lang w:val="en-US"/>
-        </w:rPr>
-        <w:t xml:space="preserve"> — When the AI completed filling out this form.</w:t>
-      </w:r>
-    </w:p>
-    <w:p>
-      <w:pPr>
-        <w:rPr>
-          <w:lang w:val="en-US"/>
-        </w:rPr>
-      </w:pPr>
-    </w:p>
+      </w:pPr>
+      <w:r>
+        <w:t>Call Details</w:t>
+      </w:r>
+    </w:p>
+    <w:tbl>
+      <w:tblPr>
+        <w:tblW w:type="auto" w:w="0"/>
+        <w:tblLook w:firstColumn="1" w:firstRow="1" w:lastColumn="0" w:lastRow="0" w:noHBand="0" w:noVBand="1" w:val="04A0"/>
+        <w:tblBorders>
+          <w:top w:val="single" w:sz="4" w:space="0" w:color="000000"/>
+          <w:left w:val="single" w:sz="4" w:space="0" w:color="000000"/>
+          <w:bottom w:val="single" w:sz="4" w:space="0" w:color="000000"/>
+          <w:right w:val="single" w:sz="4" w:space="0" w:color="000000"/>
+          <w:insideH w:val="single" w:sz="4" w:space="0" w:color="000000"/>
+          <w:insideV w:val="single" w:sz="4" w:space="0" w:color="000000"/>
+        </w:tblBorders>
+      </w:tblPr>
+      <w:tblGrid>
+        <w:gridCol w:w="4819"/>
+        <w:gridCol w:w="4819"/>
+      </w:tblGrid>
+      <w:tr>
+        <w:tc>
+          <w:tcPr>
+            <w:tcW w:type="dxa" w:w="4819"/>
+            <w:shd w:fill="D9E2F3" w:val="clear"/>
+          </w:tcPr>
+          <w:p>
+            <w:r>
+              <w:rPr>
+                <w:b/>
+              </w:rPr>
+              <w:t>Field</w:t>
+            </w:r>
+          </w:p>
+        </w:tc>
+        <w:tc>
+          <w:tcPr>
+            <w:tcW w:type="dxa" w:w="4819"/>
+            <w:shd w:fill="D9E2F3" w:val="clear"/>
+          </w:tcPr>
+          <w:p>
+            <w:r>
+              <w:rPr>
+                <w:b/>
+              </w:rPr>
+              <w:t>Value</w:t>
+            </w:r>
+          </w:p>
+        </w:tc>
+      </w:tr>
+      <w:tr>
+        <w:tc>
+          <w:tcPr>
+            <w:tcW w:type="dxa" w:w="4819"/>
+          </w:tcPr>
+          <w:p>
+            <w:r>
+              <w:rPr>
+                <w:b/>
+              </w:rPr>
+              <w:t>Date</w:t>
+            </w:r>
+          </w:p>
+        </w:tc>
+        <w:tc>
+          <w:tcPr>
+            <w:tcW w:type="dxa" w:w="4819"/>
+          </w:tcPr>
+          <w:p>
+            <w:r>
+              <w:t>{call_details.date}</w:t>
+            </w:r>
+          </w:p>
+        </w:tc>
+      </w:tr>
+      <w:tr>
+        <w:tc>
+          <w:tcPr>
+            <w:tcW w:type="dxa" w:w="4819"/>
+          </w:tcPr>
+          <w:p>
+            <w:r>
+              <w:rPr>
+                <w:b/>
+              </w:rPr>
+              <w:t>Duration</w:t>
+            </w:r>
+          </w:p>
+        </w:tc>
+        <w:tc>
+          <w:tcPr>
+            <w:tcW w:type="dxa" w:w="4819"/>
+          </w:tcPr>
+          <w:p>
+            <w:r>
+              <w:t>{call_details.duration_estimate}</w:t>
+            </w:r>
+          </w:p>
+        </w:tc>
+      </w:tr>
+      <w:tr>
+        <w:tc>
+          <w:tcPr>
+            <w:tcW w:type="dxa" w:w="4819"/>
+          </w:tcPr>
+          <w:p>
+            <w:r>
+              <w:rPr>
+                <w:b/>
+              </w:rPr>
+              <w:t>Agent Name</w:t>
+            </w:r>
+          </w:p>
+        </w:tc>
+        <w:tc>
+          <w:tcPr>
+            <w:tcW w:type="dxa" w:w="4819"/>
+          </w:tcPr>
+          <w:p>
+            <w:r>
+              <w:t>{call_details.agent_name}</w:t>
+            </w:r>
+          </w:p>
+        </w:tc>
+      </w:tr>
+    </w:tbl>
     <w:p>
       <w:pPr>
         <w:pStyle w:val="Heading2"/>
       </w:pPr>
       <w:r>
-        <w:t>caller_information</w:t>
-      </w:r>
-    </w:p>
-    <w:p>
-      <w:pPr>
-        <w:ind w:left="567"/>
-        <w:rPr>
-          <w:lang w:val="en-US"/>
-        </w:rPr>
-      </w:pPr>
-      <w:r>
-        <w:rPr>
-          <w:b/>
-          <w:color w:val="00008B"/>
-          <w:lang w:val="en-US"/>
-        </w:rPr>
-        <w:t>{caller_information.name}</w:t>
-      </w:r>
-      <w:r>
-        <w:rPr>
-          <w:lang w:val="en-US"/>
-        </w:rPr>
-        <w:t xml:space="preserve"> — Caller's full name (if mentioned).</w:t>
-      </w:r>
-    </w:p>
-    <w:p>
-      <w:pPr>
-        <w:ind w:left="567"/>
-        <w:rPr>
-          <w:lang w:val="en-US"/>
-        </w:rPr>
-      </w:pPr>
-      <w:r>
-        <w:rPr>
-          <w:b/>
-          <w:color w:val="00008B"/>
-          <w:lang w:val="en-US"/>
-        </w:rPr>
-        <w:t>{</w:t>
-      </w:r>
-      <w:proofErr w:type="spellStart"/>
-      <w:r>
-        <w:rPr>
-          <w:b/>
-          <w:color w:val="00008B"/>
-          <w:lang w:val="en-US"/>
-        </w:rPr>
-        <w:t>caller_information.account_or_reference</w:t>
-      </w:r>
-      <w:proofErr w:type="spellEnd"/>
-      <w:r>
-        <w:rPr>
-          <w:b/>
-          <w:color w:val="00008B"/>
-          <w:lang w:val="en-US"/>
-        </w:rPr>
-        <w:t>}</w:t>
-      </w:r>
-      <w:r>
-        <w:rPr>
-          <w:lang w:val="en-US"/>
-        </w:rPr>
-        <w:t xml:space="preserve"> — Any account number, customer ID, or reference mentioned.</w:t>
-      </w:r>
-    </w:p>
-    <w:p>
-      <w:pPr>
-        <w:ind w:left="567"/>
-        <w:rPr>
-          <w:lang w:val="en-US"/>
-        </w:rPr>
-      </w:pPr>
-      <w:r>
-        <w:rPr>
-          <w:b/>
-          <w:color w:val="00008B"/>
-          <w:lang w:val="en-US"/>
-        </w:rPr>
-        <w:t>{</w:t>
-      </w:r>
-      <w:proofErr w:type="spellStart"/>
-      <w:r>
-        <w:rPr>
-          <w:b/>
-          <w:color w:val="00008B"/>
-          <w:lang w:val="en-US"/>
-        </w:rPr>
-        <w:t>caller_information.contact_info</w:t>
-      </w:r>
-      <w:proofErr w:type="spellEnd"/>
-      <w:r>
-        <w:rPr>
-          <w:b/>
-          <w:color w:val="00008B"/>
-          <w:lang w:val="en-US"/>
-        </w:rPr>
-        <w:t>}</w:t>
-      </w:r>
-      <w:r>
-        <w:rPr>
-          <w:lang w:val="en-US"/>
-        </w:rPr>
-        <w:t xml:space="preserve"> — Phone number or email if mentioned.</w:t>
-      </w:r>
-    </w:p>
-    <w:p>
-      <w:pPr>
-        <w:rPr>
-          <w:lang w:val="en-US"/>
-        </w:rPr>
-      </w:pPr>
-    </w:p>
+        <w:t>Issue</w:t>
+      </w:r>
+    </w:p>
+    <w:tbl>
+      <w:tblPr>
+        <w:tblW w:type="auto" w:w="0"/>
+        <w:tblLook w:firstColumn="1" w:firstRow="1" w:lastColumn="0" w:lastRow="0" w:noHBand="0" w:noVBand="1" w:val="04A0"/>
+        <w:tblBorders>
+          <w:top w:val="single" w:sz="4" w:space="0" w:color="000000"/>
+          <w:left w:val="single" w:sz="4" w:space="0" w:color="000000"/>
+          <w:bottom w:val="single" w:sz="4" w:space="0" w:color="000000"/>
+          <w:right w:val="single" w:sz="4" w:space="0" w:color="000000"/>
+          <w:insideH w:val="single" w:sz="4" w:space="0" w:color="000000"/>
+          <w:insideV w:val="single" w:sz="4" w:space="0" w:color="000000"/>
+        </w:tblBorders>
+      </w:tblPr>
+      <w:tblGrid>
+        <w:gridCol w:w="4819"/>
+        <w:gridCol w:w="4819"/>
+      </w:tblGrid>
+      <w:tr>
+        <w:tc>
+          <w:tcPr>
+            <w:tcW w:type="dxa" w:w="4819"/>
+            <w:shd w:fill="D9E2F3" w:val="clear"/>
+          </w:tcPr>
+          <w:p>
+            <w:r>
+              <w:rPr>
+                <w:b/>
+              </w:rPr>
+              <w:t>Field</w:t>
+            </w:r>
+          </w:p>
+        </w:tc>
+        <w:tc>
+          <w:tcPr>
+            <w:tcW w:type="dxa" w:w="4819"/>
+            <w:shd w:fill="D9E2F3" w:val="clear"/>
+          </w:tcPr>
+          <w:p>
+            <w:r>
+              <w:rPr>
+                <w:b/>
+              </w:rPr>
+              <w:t>Value</w:t>
+            </w:r>
+          </w:p>
+        </w:tc>
+      </w:tr>
+      <w:tr>
+        <w:tc>
+          <w:tcPr>
+            <w:tcW w:type="dxa" w:w="4819"/>
+          </w:tcPr>
+          <w:p>
+            <w:r>
+              <w:rPr>
+                <w:b/>
+              </w:rPr>
+              <w:t>Category</w:t>
+            </w:r>
+          </w:p>
+        </w:tc>
+        <w:tc>
+          <w:tcPr>
+            <w:tcW w:type="dxa" w:w="4819"/>
+          </w:tcPr>
+          <w:p>
+            <w:r>
+              <w:t>{issue.category}</w:t>
+            </w:r>
+          </w:p>
+        </w:tc>
+      </w:tr>
+      <w:tr>
+        <w:tc>
+          <w:tcPr>
+            <w:tcW w:type="dxa" w:w="4819"/>
+          </w:tcPr>
+          <w:p>
+            <w:r>
+              <w:rPr>
+                <w:b/>
+              </w:rPr>
+              <w:t>Priority</w:t>
+            </w:r>
+          </w:p>
+        </w:tc>
+        <w:tc>
+          <w:tcPr>
+            <w:tcW w:type="dxa" w:w="4819"/>
+          </w:tcPr>
+          <w:p>
+            <w:r>
+              <w:t>{issue.priority}</w:t>
+            </w:r>
+          </w:p>
+        </w:tc>
+      </w:tr>
+      <w:tr>
+        <w:tc>
+          <w:tcPr>
+            <w:tcW w:type="dxa" w:w="4819"/>
+          </w:tcPr>
+          <w:p>
+            <w:r>
+              <w:rPr>
+                <w:b/>
+              </w:rPr>
+              <w:t>Description</w:t>
+            </w:r>
+          </w:p>
+        </w:tc>
+        <w:tc>
+          <w:tcPr>
+            <w:tcW w:type="dxa" w:w="4819"/>
+          </w:tcPr>
+          <w:p>
+            <w:r>
+              <w:t>{issue.description}</w:t>
+            </w:r>
+          </w:p>
+        </w:tc>
+      </w:tr>
+      <w:tr>
+        <w:tc>
+          <w:tcPr>
+            <w:tcW w:type="dxa" w:w="4819"/>
+          </w:tcPr>
+          <w:p>
+            <w:r>
+              <w:rPr>
+                <w:b/>
+              </w:rPr>
+              <w:t>Error Messages</w:t>
+            </w:r>
+          </w:p>
+        </w:tc>
+        <w:tc>
+          <w:tcPr>
+            <w:tcW w:type="dxa" w:w="4819"/>
+          </w:tcPr>
+          <w:p>
+            <w:r>
+              <w:t>{issue.error_messages}</w:t>
+            </w:r>
+          </w:p>
+        </w:tc>
+      </w:tr>
+    </w:tbl>
     <w:p>
       <w:pPr>
         <w:pStyle w:val="Heading2"/>
       </w:pPr>
       <w:r>
-        <w:t>call_details</w:t>
-      </w:r>
-    </w:p>
-    <w:p>
-      <w:pPr>
-        <w:ind w:left="567"/>
-        <w:rPr>
-          <w:lang w:val="en-US"/>
-        </w:rPr>
-      </w:pPr>
-      <w:r>
-        <w:rPr>
-          <w:b/>
-          <w:color w:val="00008B"/>
-          <w:lang w:val="en-US"/>
-        </w:rPr>
-        <w:t>{</w:t>
-      </w:r>
-      <w:proofErr w:type="spellStart"/>
-      <w:r>
-        <w:rPr>
-          <w:b/>
-          <w:color w:val="00008B"/>
-          <w:lang w:val="en-US"/>
-        </w:rPr>
-        <w:t>call_details.date</w:t>
-      </w:r>
-      <w:proofErr w:type="spellEnd"/>
-      <w:r>
-        <w:rPr>
-          <w:b/>
-          <w:color w:val="00008B"/>
-          <w:lang w:val="en-US"/>
-        </w:rPr>
-        <w:t>}</w:t>
-      </w:r>
-      <w:r>
-        <w:rPr>
-          <w:lang w:val="en-US"/>
-        </w:rPr>
-        <w:t xml:space="preserve"> — Date/time of the call.</w:t>
-      </w:r>
-    </w:p>
-    <w:p>
-      <w:pPr>
-        <w:ind w:left="567"/>
-        <w:rPr>
-          <w:lang w:val="en-US"/>
-        </w:rPr>
-      </w:pPr>
-      <w:r>
-        <w:rPr>
-          <w:b/>
-          <w:color w:val="00008B"/>
-          <w:lang w:val="en-US"/>
-        </w:rPr>
-        <w:t>{</w:t>
-      </w:r>
-      <w:proofErr w:type="spellStart"/>
-      <w:r>
-        <w:rPr>
-          <w:b/>
-          <w:color w:val="00008B"/>
-          <w:lang w:val="en-US"/>
-        </w:rPr>
-        <w:t>call_details.duration_estimate</w:t>
-      </w:r>
-      <w:proofErr w:type="spellEnd"/>
-      <w:r>
-        <w:rPr>
-          <w:b/>
-          <w:color w:val="00008B"/>
-          <w:lang w:val="en-US"/>
-        </w:rPr>
-        <w:t>}</w:t>
-      </w:r>
-      <w:r>
-        <w:rPr>
-          <w:lang w:val="en-US"/>
-        </w:rPr>
-        <w:t xml:space="preserve"> — Estimated call duration based on transcript length.</w:t>
-      </w:r>
-    </w:p>
-    <w:p>
-      <w:pPr>
-        <w:ind w:left="567"/>
-        <w:rPr>
-          <w:lang w:val="en-US"/>
-        </w:rPr>
-      </w:pPr>
-      <w:r>
-        <w:rPr>
-          <w:b/>
-          <w:color w:val="00008B"/>
-          <w:lang w:val="en-US"/>
-        </w:rPr>
-        <w:t>{</w:t>
-      </w:r>
-      <w:proofErr w:type="spellStart"/>
-      <w:r>
-        <w:rPr>
-          <w:b/>
-          <w:color w:val="00008B"/>
-          <w:lang w:val="en-US"/>
-        </w:rPr>
-        <w:t>call_details.agent_name</w:t>
-      </w:r>
-      <w:proofErr w:type="spellEnd"/>
-      <w:r>
-        <w:rPr>
-          <w:b/>
-          <w:color w:val="00008B"/>
-          <w:lang w:val="en-US"/>
-        </w:rPr>
-        <w:t>}</w:t>
-      </w:r>
-      <w:r>
-        <w:rPr>
-          <w:lang w:val="en-US"/>
-        </w:rPr>
-        <w:t xml:space="preserve"> — Name of the support agent.</w:t>
-      </w:r>
-    </w:p>
-    <w:p>
-      <w:pPr>
-        <w:rPr>
-          <w:lang w:val="en-US"/>
-        </w:rPr>
-      </w:pPr>
-    </w:p>
+        <w:t>Resolution</w:t>
+      </w:r>
+    </w:p>
+    <w:tbl>
+      <w:tblPr>
+        <w:tblW w:type="auto" w:w="0"/>
+        <w:tblLook w:firstColumn="1" w:firstRow="1" w:lastColumn="0" w:lastRow="0" w:noHBand="0" w:noVBand="1" w:val="04A0"/>
+        <w:tblBorders>
+          <w:top w:val="single" w:sz="4" w:space="0" w:color="000000"/>
+          <w:left w:val="single" w:sz="4" w:space="0" w:color="000000"/>
+          <w:bottom w:val="single" w:sz="4" w:space="0" w:color="000000"/>
+          <w:right w:val="single" w:sz="4" w:space="0" w:color="000000"/>
+          <w:insideH w:val="single" w:sz="4" w:space="0" w:color="000000"/>
+          <w:insideV w:val="single" w:sz="4" w:space="0" w:color="000000"/>
+        </w:tblBorders>
+      </w:tblPr>
+      <w:tblGrid>
+        <w:gridCol w:w="4819"/>
+        <w:gridCol w:w="4819"/>
+      </w:tblGrid>
+      <w:tr>
+        <w:tc>
+          <w:tcPr>
+            <w:tcW w:type="dxa" w:w="4819"/>
+            <w:shd w:fill="D9E2F3" w:val="clear"/>
+          </w:tcPr>
+          <w:p>
+            <w:r>
+              <w:rPr>
+                <w:b/>
+              </w:rPr>
+              <w:t>Field</w:t>
+            </w:r>
+          </w:p>
+        </w:tc>
+        <w:tc>
+          <w:tcPr>
+            <w:tcW w:type="dxa" w:w="4819"/>
+            <w:shd w:fill="D9E2F3" w:val="clear"/>
+          </w:tcPr>
+          <w:p>
+            <w:r>
+              <w:rPr>
+                <w:b/>
+              </w:rPr>
+              <w:t>Value</w:t>
+            </w:r>
+          </w:p>
+        </w:tc>
+      </w:tr>
+      <w:tr>
+        <w:tc>
+          <w:tcPr>
+            <w:tcW w:type="dxa" w:w="4819"/>
+          </w:tcPr>
+          <w:p>
+            <w:r>
+              <w:rPr>
+                <w:b/>
+              </w:rPr>
+              <w:t>Status</w:t>
+            </w:r>
+          </w:p>
+        </w:tc>
+        <w:tc>
+          <w:tcPr>
+            <w:tcW w:type="dxa" w:w="4819"/>
+          </w:tcPr>
+          <w:p>
+            <w:r>
+              <w:t>{resolution.status}</w:t>
+            </w:r>
+          </w:p>
+        </w:tc>
+      </w:tr>
+      <w:tr>
+        <w:tc>
+          <w:tcPr>
+            <w:tcW w:type="dxa" w:w="4819"/>
+          </w:tcPr>
+          <w:p>
+            <w:r>
+              <w:rPr>
+                <w:b/>
+              </w:rPr>
+              <w:t>Steps Taken</w:t>
+            </w:r>
+          </w:p>
+        </w:tc>
+        <w:tc>
+          <w:tcPr>
+            <w:tcW w:type="dxa" w:w="4819"/>
+          </w:tcPr>
+          <w:p>
+            <w:r>
+              <w:t>{resolution.steps_taken}</w:t>
+            </w:r>
+          </w:p>
+        </w:tc>
+      </w:tr>
+      <w:tr>
+        <w:tc>
+          <w:tcPr>
+            <w:tcW w:type="dxa" w:w="4819"/>
+          </w:tcPr>
+          <w:p>
+            <w:r>
+              <w:rPr>
+                <w:b/>
+              </w:rPr>
+              <w:t>Outcome</w:t>
+            </w:r>
+          </w:p>
+        </w:tc>
+        <w:tc>
+          <w:tcPr>
+            <w:tcW w:type="dxa" w:w="4819"/>
+          </w:tcPr>
+          <w:p>
+            <w:r>
+              <w:t>{resolution.outcome}</w:t>
+            </w:r>
+          </w:p>
+        </w:tc>
+      </w:tr>
+    </w:tbl>
     <w:p>
       <w:pPr>
         <w:pStyle w:val="Heading2"/>
       </w:pPr>
       <w:r>
-        <w:t>issue</w:t>
-      </w:r>
-    </w:p>
-    <w:p>
-      <w:pPr>
-        <w:ind w:left="567"/>
-        <w:rPr>
-          <w:lang w:val="en-US"/>
-        </w:rPr>
-      </w:pPr>
-      <w:r>
-        <w:rPr>
-          <w:b/>
-          <w:color w:val="00008B"/>
-          <w:lang w:val="en-US"/>
-        </w:rPr>
-        <w:t>{</w:t>
-      </w:r>
-      <w:proofErr w:type="spellStart"/>
-      <w:r>
-        <w:rPr>
-          <w:b/>
-          <w:color w:val="00008B"/>
-          <w:lang w:val="en-US"/>
-        </w:rPr>
-        <w:t>issue.category</w:t>
-      </w:r>
-      <w:proofErr w:type="spellEnd"/>
-      <w:r>
-        <w:rPr>
-          <w:b/>
-          <w:color w:val="00008B"/>
-          <w:lang w:val="en-US"/>
-        </w:rPr>
-        <w:t>}</w:t>
-      </w:r>
-      <w:r>
-        <w:rPr>
-          <w:lang w:val="en-US"/>
-        </w:rPr>
-        <w:t xml:space="preserve"> — Primary issue category.</w:t>
-      </w:r>
-    </w:p>
-    <w:p>
-      <w:pPr>
-        <w:ind w:left="567"/>
-        <w:rPr>
-          <w:lang w:val="en-US"/>
-        </w:rPr>
-      </w:pPr>
-      <w:r>
-        <w:rPr>
-          <w:b/>
-          <w:color w:val="00008B"/>
-          <w:lang w:val="en-US"/>
-        </w:rPr>
-        <w:t>{</w:t>
-      </w:r>
-      <w:proofErr w:type="spellStart"/>
-      <w:r>
-        <w:rPr>
-          <w:b/>
-          <w:color w:val="00008B"/>
-          <w:lang w:val="en-US"/>
-        </w:rPr>
-        <w:t>issue.priority</w:t>
-      </w:r>
-      <w:proofErr w:type="spellEnd"/>
-      <w:r>
-        <w:rPr>
-          <w:b/>
-          <w:color w:val="00008B"/>
-          <w:lang w:val="en-US"/>
-        </w:rPr>
-        <w:t>}</w:t>
-      </w:r>
-      <w:r>
-        <w:rPr>
-          <w:lang w:val="en-US"/>
-        </w:rPr>
-        <w:t xml:space="preserve"> — Estimated priority based on urgency expressed in the call.</w:t>
-      </w:r>
-    </w:p>
-    <w:p>
-      <w:pPr>
-        <w:ind w:left="567"/>
-        <w:rPr>
-          <w:lang w:val="en-US"/>
-        </w:rPr>
-      </w:pPr>
-      <w:r>
-        <w:rPr>
-          <w:b/>
-          <w:color w:val="00008B"/>
-          <w:lang w:val="en-US"/>
-        </w:rPr>
-        <w:t>{</w:t>
-      </w:r>
-      <w:proofErr w:type="spellStart"/>
-      <w:r>
-        <w:rPr>
-          <w:b/>
-          <w:color w:val="00008B"/>
-          <w:lang w:val="en-US"/>
-        </w:rPr>
-        <w:t>issue.description</w:t>
-      </w:r>
-      <w:proofErr w:type="spellEnd"/>
-      <w:r>
-        <w:rPr>
-          <w:b/>
-          <w:color w:val="00008B"/>
-          <w:lang w:val="en-US"/>
-        </w:rPr>
-        <w:t>}</w:t>
-      </w:r>
-      <w:r>
-        <w:rPr>
-          <w:lang w:val="en-US"/>
-        </w:rPr>
-        <w:t xml:space="preserve"> — Clear description of the problem the caller reported.</w:t>
-      </w:r>
-    </w:p>
-    <w:p>
-      <w:pPr>
-        <w:ind w:left="567"/>
-        <w:rPr>
-          <w:lang w:val="en-US"/>
-        </w:rPr>
-      </w:pPr>
-      <w:r>
-        <w:rPr>
-          <w:b/>
-          <w:color w:val="00008B"/>
-          <w:lang w:val="en-US"/>
-        </w:rPr>
-        <w:t>{</w:t>
-      </w:r>
-      <w:proofErr w:type="spellStart"/>
-      <w:r>
-        <w:rPr>
-          <w:b/>
-          <w:color w:val="00008B"/>
-          <w:lang w:val="en-US"/>
-        </w:rPr>
-        <w:t>issue.error_messages</w:t>
-      </w:r>
-      <w:proofErr w:type="spellEnd"/>
-      <w:r>
-        <w:rPr>
-          <w:b/>
-          <w:color w:val="00008B"/>
-          <w:lang w:val="en-US"/>
-        </w:rPr>
-        <w:t>}</w:t>
-      </w:r>
-      <w:r>
-        <w:rPr>
-          <w:lang w:val="en-US"/>
-        </w:rPr>
-        <w:t xml:space="preserve"> — Any specific error messages or codes mentioned.</w:t>
-      </w:r>
-    </w:p>
-    <w:p>
-      <w:pPr>
-        <w:rPr>
-          <w:lang w:val="en-US"/>
-        </w:rPr>
-      </w:pPr>
-    </w:p>
+        <w:t>Follow-Up</w:t>
+      </w:r>
+    </w:p>
+    <w:tbl>
+      <w:tblPr>
+        <w:tblW w:type="auto" w:w="0"/>
+        <w:tblLook w:firstColumn="1" w:firstRow="1" w:lastColumn="0" w:lastRow="0" w:noHBand="0" w:noVBand="1" w:val="04A0"/>
+        <w:tblBorders>
+          <w:top w:val="single" w:sz="4" w:space="0" w:color="000000"/>
+          <w:left w:val="single" w:sz="4" w:space="0" w:color="000000"/>
+          <w:bottom w:val="single" w:sz="4" w:space="0" w:color="000000"/>
+          <w:right w:val="single" w:sz="4" w:space="0" w:color="000000"/>
+          <w:insideH w:val="single" w:sz="4" w:space="0" w:color="000000"/>
+          <w:insideV w:val="single" w:sz="4" w:space="0" w:color="000000"/>
+        </w:tblBorders>
+      </w:tblPr>
+      <w:tblGrid>
+        <w:gridCol w:w="4819"/>
+        <w:gridCol w:w="4819"/>
+      </w:tblGrid>
+      <w:tr>
+        <w:tc>
+          <w:tcPr>
+            <w:tcW w:type="dxa" w:w="4819"/>
+            <w:shd w:fill="D9E2F3" w:val="clear"/>
+          </w:tcPr>
+          <w:p>
+            <w:r>
+              <w:rPr>
+                <w:b/>
+              </w:rPr>
+              <w:t>Field</w:t>
+            </w:r>
+          </w:p>
+        </w:tc>
+        <w:tc>
+          <w:tcPr>
+            <w:tcW w:type="dxa" w:w="4819"/>
+            <w:shd w:fill="D9E2F3" w:val="clear"/>
+          </w:tcPr>
+          <w:p>
+            <w:r>
+              <w:rPr>
+                <w:b/>
+              </w:rPr>
+              <w:t>Value</w:t>
+            </w:r>
+          </w:p>
+        </w:tc>
+      </w:tr>
+      <w:tr>
+        <w:tc>
+          <w:tcPr>
+            <w:tcW w:type="dxa" w:w="4819"/>
+          </w:tcPr>
+          <w:p>
+            <w:r>
+              <w:rPr>
+                <w:b/>
+              </w:rPr>
+              <w:t>Required</w:t>
+            </w:r>
+          </w:p>
+        </w:tc>
+        <w:tc>
+          <w:tcPr>
+            <w:tcW w:type="dxa" w:w="4819"/>
+          </w:tcPr>
+          <w:p>
+            <w:r>
+              <w:t>{follow_up.required}</w:t>
+            </w:r>
+          </w:p>
+        </w:tc>
+      </w:tr>
+      <w:tr>
+        <w:tc>
+          <w:tcPr>
+            <w:tcW w:type="dxa" w:w="4819"/>
+          </w:tcPr>
+          <w:p>
+            <w:r>
+              <w:rPr>
+                <w:b/>
+              </w:rPr>
+              <w:t>Actions</w:t>
+            </w:r>
+          </w:p>
+        </w:tc>
+        <w:tc>
+          <w:tcPr>
+            <w:tcW w:type="dxa" w:w="4819"/>
+          </w:tcPr>
+          <w:p>
+            <w:r>
+              <w:t>{follow_up.actions}</w:t>
+            </w:r>
+          </w:p>
+        </w:tc>
+      </w:tr>
+      <w:tr>
+        <w:tc>
+          <w:tcPr>
+            <w:tcW w:type="dxa" w:w="4819"/>
+          </w:tcPr>
+          <w:p>
+            <w:r>
+              <w:rPr>
+                <w:b/>
+              </w:rPr>
+              <w:t>Department</w:t>
+            </w:r>
+          </w:p>
+        </w:tc>
+        <w:tc>
+          <w:tcPr>
+            <w:tcW w:type="dxa" w:w="4819"/>
+          </w:tcPr>
+          <w:p>
+            <w:r>
+              <w:t>{follow_up.department}</w:t>
+            </w:r>
+          </w:p>
+        </w:tc>
+      </w:tr>
+    </w:tbl>
     <w:p>
       <w:pPr>
         <w:pStyle w:val="Heading2"/>
       </w:pPr>
       <w:r>
-        <w:t>resolution</w:t>
-      </w:r>
-    </w:p>
-    <w:p>
-      <w:pPr>
-        <w:ind w:left="567"/>
-        <w:rPr>
-          <w:lang w:val="en-US"/>
-        </w:rPr>
-      </w:pPr>
-      <w:r>
-        <w:rPr>
-          <w:b/>
-          <w:color w:val="00008B"/>
-          <w:lang w:val="en-US"/>
-        </w:rPr>
-        <w:t>{</w:t>
-      </w:r>
-      <w:proofErr w:type="spellStart"/>
-      <w:r>
-        <w:rPr>
-          <w:b/>
-          <w:color w:val="00008B"/>
-          <w:lang w:val="en-US"/>
-        </w:rPr>
-        <w:t>resolution.status</w:t>
-      </w:r>
-      <w:proofErr w:type="spellEnd"/>
-      <w:r>
-        <w:rPr>
-          <w:b/>
-          <w:color w:val="00008B"/>
-          <w:lang w:val="en-US"/>
-        </w:rPr>
-        <w:t>}</w:t>
-      </w:r>
-      <w:r>
-        <w:rPr>
-          <w:lang w:val="en-US"/>
-        </w:rPr>
-        <w:t xml:space="preserve"> — Whether the issue was resolved during the call.</w:t>
-      </w:r>
-    </w:p>
-    <w:p>
-      <w:pPr>
-        <w:ind w:left="567"/>
-        <w:rPr>
-          <w:lang w:val="en-US"/>
-        </w:rPr>
-      </w:pPr>
-      <w:r>
-        <w:rPr>
-          <w:b/>
-          <w:color w:val="00008B"/>
-          <w:lang w:val="en-US"/>
-        </w:rPr>
-        <w:t>{</w:t>
-      </w:r>
-      <w:proofErr w:type="spellStart"/>
-      <w:r>
-        <w:rPr>
-          <w:b/>
-          <w:color w:val="00008B"/>
-          <w:lang w:val="en-US"/>
-        </w:rPr>
-        <w:t>resolution.steps_taken</w:t>
-      </w:r>
-      <w:proofErr w:type="spellEnd"/>
-      <w:r>
-        <w:rPr>
-          <w:b/>
-          <w:color w:val="00008B"/>
-          <w:lang w:val="en-US"/>
-        </w:rPr>
-        <w:t>}</w:t>
-      </w:r>
-      <w:r>
-        <w:rPr>
-          <w:lang w:val="en-US"/>
-        </w:rPr>
-        <w:t xml:space="preserve"> — Steps the agent took to resolve the issue.</w:t>
-      </w:r>
-    </w:p>
-    <w:p>
-      <w:pPr>
-        <w:ind w:left="567"/>
-        <w:rPr>
-          <w:lang w:val="en-US"/>
-        </w:rPr>
-      </w:pPr>
-      <w:r>
-        <w:rPr>
-          <w:b/>
-          <w:color w:val="00008B"/>
-          <w:lang w:val="en-US"/>
-        </w:rPr>
-        <w:t>{</w:t>
-      </w:r>
-      <w:proofErr w:type="spellStart"/>
-      <w:r>
-        <w:rPr>
-          <w:b/>
-          <w:color w:val="00008B"/>
-          <w:lang w:val="en-US"/>
-        </w:rPr>
-        <w:t>resolution.outcome</w:t>
-      </w:r>
-      <w:proofErr w:type="spellEnd"/>
-      <w:r>
-        <w:rPr>
-          <w:b/>
-          <w:color w:val="00008B"/>
-          <w:lang w:val="en-US"/>
-        </w:rPr>
-        <w:t>}</w:t>
-      </w:r>
-      <w:r>
-        <w:rPr>
-          <w:lang w:val="en-US"/>
-        </w:rPr>
-        <w:t xml:space="preserve"> — Final outcome of the call.</w:t>
-      </w:r>
-    </w:p>
-    <w:p>
-      <w:pPr>
-        <w:rPr>
-          <w:lang w:val="en-US"/>
-        </w:rPr>
-      </w:pPr>
+        <w:t>Customer Sentiment</w:t>
+      </w:r>
+    </w:p>
+    <w:p>
+      <w:r>
+        <w:t>{customer_sentiment}</w:t>
+      </w:r>
     </w:p>
     <w:p>
       <w:pPr>
         <w:pStyle w:val="Heading2"/>
       </w:pPr>
       <w:r>
-        <w:t>follow_up</w:t>
-      </w:r>
-    </w:p>
-    <w:p>
-      <w:pPr>
-        <w:ind w:left="567"/>
-        <w:rPr>
-          <w:lang w:val="en-US"/>
-        </w:rPr>
-      </w:pPr>
-      <w:r>
-        <w:rPr>
-          <w:b/>
-          <w:color w:val="00008B"/>
-          <w:lang w:val="en-US"/>
-        </w:rPr>
-        <w:t>{</w:t>
-      </w:r>
-      <w:proofErr w:type="spellStart"/>
-      <w:r>
-        <w:rPr>
-          <w:b/>
-          <w:color w:val="00008B"/>
-          <w:lang w:val="en-US"/>
-        </w:rPr>
-        <w:t>follow_up.required</w:t>
-      </w:r>
-      <w:proofErr w:type="spellEnd"/>
-      <w:r>
-        <w:rPr>
-          <w:b/>
-          <w:color w:val="00008B"/>
-          <w:lang w:val="en-US"/>
-        </w:rPr>
-        <w:t>}</w:t>
-      </w:r>
-      <w:r>
-        <w:rPr>
-          <w:lang w:val="en-US"/>
-        </w:rPr>
-        <w:t xml:space="preserve"> — Whether follow-up action is needed.</w:t>
-      </w:r>
-    </w:p>
-    <w:p>
-      <w:pPr>
-        <w:ind w:left="567"/>
-        <w:rPr>
-          <w:lang w:val="en-US"/>
-        </w:rPr>
-      </w:pPr>
-      <w:r>
-        <w:rPr>
-          <w:b/>
-          <w:color w:val="00008B"/>
-          <w:lang w:val="en-US"/>
-        </w:rPr>
-        <w:t>{</w:t>
-      </w:r>
-      <w:proofErr w:type="spellStart"/>
-      <w:r>
-        <w:rPr>
-          <w:b/>
-          <w:color w:val="00008B"/>
-          <w:lang w:val="en-US"/>
-        </w:rPr>
-        <w:t>follow_up.actions</w:t>
-      </w:r>
-      <w:proofErr w:type="spellEnd"/>
-      <w:r>
-        <w:rPr>
-          <w:b/>
-          <w:color w:val="00008B"/>
-          <w:lang w:val="en-US"/>
-        </w:rPr>
-        <w:t>}</w:t>
-      </w:r>
-      <w:r>
-        <w:rPr>
-          <w:lang w:val="en-US"/>
-        </w:rPr>
-        <w:t xml:space="preserve"> — Specific follow-up actions needed.</w:t>
-      </w:r>
-    </w:p>
-    <w:p>
-      <w:pPr>
-        <w:ind w:left="567"/>
-        <w:rPr>
-          <w:lang w:val="en-US"/>
-        </w:rPr>
-      </w:pPr>
-      <w:r>
-        <w:rPr>
-          <w:b/>
-          <w:color w:val="00008B"/>
-          <w:lang w:val="en-US"/>
-        </w:rPr>
-        <w:t>{</w:t>
-      </w:r>
-      <w:proofErr w:type="spellStart"/>
-      <w:r>
-        <w:rPr>
-          <w:b/>
-          <w:color w:val="00008B"/>
-          <w:lang w:val="en-US"/>
-        </w:rPr>
-        <w:t>follow_up.department</w:t>
-      </w:r>
-      <w:proofErr w:type="spellEnd"/>
-      <w:r>
-        <w:rPr>
-          <w:b/>
-          <w:color w:val="00008B"/>
-          <w:lang w:val="en-US"/>
-        </w:rPr>
-        <w:t>}</w:t>
-      </w:r>
-      <w:r>
-        <w:rPr>
-          <w:lang w:val="en-US"/>
-        </w:rPr>
-        <w:t xml:space="preserve"> — Department to escalate/forward to, if applicable.</w:t>
-      </w:r>
-    </w:p>
-    <w:p>
-      <w:pPr>
-        <w:rPr>
-          <w:lang w:val="en-US"/>
-        </w:rPr>
-      </w:pPr>
+        <w:t>Call Summary</w:t>
+      </w:r>
+    </w:p>
+    <w:p>
+      <w:r>
+        <w:t>{call_summary}</w:t>
+      </w:r>
     </w:p>
     <w:p>
       <w:pPr>
         <w:pStyle w:val="Heading2"/>
-        <w:rPr>
-          <w:lang w:val="en-US"/>
-        </w:rPr>
-      </w:pPr>
-      <w:proofErr w:type="spellStart"/>
-      <w:r>
-        <w:rPr>
-          <w:lang w:val="en-US"/>
-        </w:rPr>
-        <w:t>customer_sentiment</w:t>
-      </w:r>
-      <w:proofErr w:type="spellEnd"/>
-      <w:r>
-        <w:rPr>
-          <w:lang w:val="en-US"/>
-        </w:rPr>
-        <w:t xml:space="preserve"> — Customer's apparent satisfaction level.</w:t>
-      </w:r>
-    </w:p>
-    <w:p>
-      <w:pPr>
-        <w:ind w:left="567"/>
-        <w:rPr>
-          <w:lang w:val="en-US"/>
-        </w:rPr>
-      </w:pPr>
-      <w:r>
-        <w:rPr>
-          <w:b/>
-          <w:color w:val="00008B"/>
-          <w:lang w:val="en-US"/>
-        </w:rPr>
-        <w:t>{</w:t>
-      </w:r>
-      <w:proofErr w:type="spellStart"/>
-      <w:r>
-        <w:rPr>
-          <w:b/>
-          <w:color w:val="00008B"/>
-          <w:lang w:val="en-US"/>
-        </w:rPr>
-        <w:t>customer_sentiment</w:t>
-      </w:r>
-      <w:proofErr w:type="spellEnd"/>
-      <w:r>
-        <w:rPr>
-          <w:b/>
-          <w:color w:val="00008B"/>
-          <w:lang w:val="en-US"/>
-        </w:rPr>
-        <w:t>}</w:t>
-      </w:r>
-      <w:r>
-        <w:rPr>
-          <w:lang w:val="en-US"/>
-        </w:rPr>
-        <w:t xml:space="preserve"> — Customer's apparent satisfaction level.</w:t>
-      </w:r>
-    </w:p>
-    <w:p>
-      <w:pPr>
-        <w:rPr>
-          <w:lang w:val="en-US"/>
-        </w:rPr>
-      </w:pPr>
-    </w:p>
-    <w:p>
-      <w:pPr>
-        <w:pStyle w:val="Heading2"/>
-        <w:rPr>
-          <w:lang w:val="en-US"/>
-        </w:rPr>
-      </w:pPr>
-      <w:proofErr w:type="spellStart"/>
-      <w:r>
-        <w:rPr>
-          <w:lang w:val="en-US"/>
-        </w:rPr>
-        <w:lastRenderedPageBreak/>
-        <w:t>call_summary</w:t>
-      </w:r>
-      <w:proofErr w:type="spellEnd"/>
-      <w:r>
-        <w:rPr>
-          <w:lang w:val="en-US"/>
-        </w:rPr>
-        <w:t xml:space="preserve"> — Brief 2-3 sentence summary of the entire call.</w:t>
-      </w:r>
-    </w:p>
-    <w:p>
-      <w:pPr>
-        <w:ind w:left="567"/>
-        <w:rPr>
-          <w:lang w:val="en-US"/>
-        </w:rPr>
-      </w:pPr>
-      <w:r>
-        <w:rPr>
-          <w:b/>
-          <w:color w:val="00008B"/>
-          <w:lang w:val="en-US"/>
-        </w:rPr>
-        <w:t>{</w:t>
-      </w:r>
-      <w:proofErr w:type="spellStart"/>
-      <w:r>
-        <w:rPr>
-          <w:b/>
-          <w:color w:val="00008B"/>
-          <w:lang w:val="en-US"/>
-        </w:rPr>
-        <w:t>call_summary</w:t>
-      </w:r>
-      <w:proofErr w:type="spellEnd"/>
-      <w:r>
-        <w:rPr>
-          <w:b/>
-          <w:color w:val="00008B"/>
-          <w:lang w:val="en-US"/>
-        </w:rPr>
-        <w:t>}</w:t>
-      </w:r>
-      <w:r>
-        <w:rPr>
-          <w:lang w:val="en-US"/>
-        </w:rPr>
-        <w:t xml:space="preserve"> — Brief 2-3 sentence summary of the entire call.</w:t>
-      </w:r>
-    </w:p>
-    <w:p>
-      <w:pPr>
-        <w:rPr>
-          <w:lang w:val="en-US"/>
-        </w:rPr>
-      </w:pPr>
-    </w:p>
-    <w:p>
-      <w:pPr>
-        <w:pStyle w:val="Heading2"/>
-      </w:pPr>
-      <w:r>
-        <w:t>transcript</w:t>
-      </w:r>
-    </w:p>
-    <w:p>
-      <w:pPr>
-        <w:ind w:left="567"/>
-      </w:pPr>
-      <w:r>
-        <w:rPr>
-          <w:b/>
-          <w:color w:val="00008B"/>
-        </w:rPr>
+      </w:pPr>
+      <w:r>
+        <w:t>Transcript</w:t>
+      </w:r>
+    </w:p>
+    <w:p>
+      <w:r>
         <w:t>{transcript.full_text}</w:t>
       </w:r>
     </w:p>
     <w:p>
-      <w:pPr>
-        <w:ind w:left="567"/>
-      </w:pPr>
-      <w:r>
-        <w:rPr>
-          <w:b/>
-          <w:color w:val="00008B"/>
-        </w:rPr>
-        <w:t>{transcript.word_count}</w:t>
-      </w:r>
-    </w:p>
-    <w:p/>
+      <w:r>
+        <w:t>Word count: {transcript.word_count}</w:t>
+      </w:r>
+    </w:p>
     <w:sectPr>
       <w:headerReference w:type="even" r:id="rId9"/>
       <w:headerReference w:type="default" r:id="rId10"/>

</xml_diff>